<commit_message>
Modificacion del docx y pdf
</commit_message>
<xml_diff>
--- a/TPI ASI.docx
+++ b/TPI ASI.docx
@@ -1,6 +1,6 @@
 
 <file path=word/document.xml><?xml version="1.0" encoding="utf-8"?>
-<w:document xmlns:wpc="http://schemas.microsoft.com/office/word/2010/wordprocessingCanvas" xmlns:cx="http://schemas.microsoft.com/office/drawing/2014/chartex" xmlns:cx1="http://schemas.microsoft.com/office/drawing/2015/9/8/chartex" xmlns:cx2="http://schemas.microsoft.com/office/drawing/2015/10/21/chartex" xmlns:cx3="http://schemas.microsoft.com/office/drawing/2016/5/9/chartex" xmlns:cx4="http://schemas.microsoft.com/office/drawing/2016/5/10/chartex" xmlns:cx5="http://schemas.microsoft.com/office/drawing/2016/5/11/chartex" xmlns:cx6="http://schemas.microsoft.com/office/drawing/2016/5/12/chartex" xmlns:cx7="http://schemas.microsoft.com/office/drawing/2016/5/13/chartex" xmlns:cx8="http://schemas.microsoft.com/office/drawing/2016/5/14/chartex" xmlns:mc="http://schemas.openxmlformats.org/markup-compatibility/2006" xmlns:aink="http://schemas.microsoft.com/office/drawing/2016/ink" xmlns:am3d="http://schemas.microsoft.com/office/drawing/2017/model3d" xmlns:o="urn:schemas-microsoft-com:office:office" xmlns:oel="http://schemas.microsoft.com/office/2019/extlst" xmlns:r="http://schemas.openxmlformats.org/officeDocument/2006/relationships" xmlns:m="http://schemas.openxmlformats.org/officeDocument/2006/math" xmlns:v="urn:schemas-microsoft-com:vml" xmlns:wp14="http://schemas.microsoft.com/office/word/2010/wordprocessingDrawing" xmlns:wp="http://schemas.openxmlformats.org/drawingml/2006/wordprocessingDrawing" xmlns:w10="urn:schemas-microsoft-com:office:word" xmlns:w="http://schemas.openxmlformats.org/wordprocessingml/2006/main" xmlns:w14="http://schemas.microsoft.com/office/word/2010/wordml" xmlns:w15="http://schemas.microsoft.com/office/word/2012/wordml" xmlns:w16cei="http://schemas.microsoft.com/office/word/2026/wordml/cei" xmlns:w16cex="http://schemas.microsoft.com/office/word/2018/wordml/cex" xmlns:w16cid="http://schemas.microsoft.com/office/word/2016/wordml/cid" xmlns:w16="http://schemas.microsoft.com/office/word/2018/wordml" xmlns:w16du="http://schemas.microsoft.com/office/word/2023/wordml/word16du" xmlns:w16sdtdh="http://schemas.microsoft.com/office/word/2020/wordml/sdtdatahash" xmlns:w16sdtfl="http://schemas.microsoft.com/office/word/2024/wordml/sdtformatlock" xmlns:w16se="http://schemas.microsoft.com/office/word/2015/wordml/symex" xmlns:wpg="http://schemas.microsoft.com/office/word/2010/wordprocessingGroup" xmlns:wpi="http://schemas.microsoft.com/office/word/2010/wordprocessingInk" xmlns:wne="http://schemas.microsoft.com/office/word/2006/wordml" xmlns:wps="http://schemas.microsoft.com/office/word/2010/wordprocessingShape" mc:Ignorable="w14 w15 w16se w16cid w16 w16cex w16sdtdh w16sdtfl w16du wp14">
+<w:document xmlns:wpc="http://schemas.microsoft.com/office/word/2010/wordprocessingCanvas" xmlns:cx="http://schemas.microsoft.com/office/drawing/2014/chartex" xmlns:cx1="http://schemas.microsoft.com/office/drawing/2015/9/8/chartex" xmlns:cx2="http://schemas.microsoft.com/office/drawing/2015/10/21/chartex" xmlns:cx3="http://schemas.microsoft.com/office/drawing/2016/5/9/chartex" xmlns:cx4="http://schemas.microsoft.com/office/drawing/2016/5/10/chartex" xmlns:cx5="http://schemas.microsoft.com/office/drawing/2016/5/11/chartex" xmlns:cx6="http://schemas.microsoft.com/office/drawing/2016/5/12/chartex" xmlns:cx7="http://schemas.microsoft.com/office/drawing/2016/5/13/chartex" xmlns:cx8="http://schemas.microsoft.com/office/drawing/2016/5/14/chartex" xmlns:mc="http://schemas.openxmlformats.org/markup-compatibility/2006" xmlns:aink="http://schemas.microsoft.com/office/drawing/2016/ink" xmlns:am3d="http://schemas.microsoft.com/office/drawing/2017/model3d" xmlns:o="urn:schemas-microsoft-com:office:office" xmlns:oel="http://schemas.microsoft.com/office/2019/extlst" xmlns:r="http://schemas.openxmlformats.org/officeDocument/2006/relationships" xmlns:m="http://schemas.openxmlformats.org/officeDocument/2006/math" xmlns:v="urn:schemas-microsoft-com:vml" xmlns:wp14="http://schemas.microsoft.com/office/word/2010/wordprocessingDrawing" xmlns:wp="http://schemas.openxmlformats.org/drawingml/2006/wordprocessingDrawing" xmlns:w10="urn:schemas-microsoft-com:office:word" xmlns:w="http://schemas.openxmlformats.org/wordprocessingml/2006/main" xmlns:w14="http://schemas.microsoft.com/office/word/2010/wordml" xmlns:w15="http://schemas.microsoft.com/office/word/2012/wordml" xmlns:w16cex="http://schemas.microsoft.com/office/word/2018/wordml/cex" xmlns:w16cid="http://schemas.microsoft.com/office/word/2016/wordml/cid" xmlns:w16="http://schemas.microsoft.com/office/word/2018/wordml" xmlns:w16du="http://schemas.microsoft.com/office/word/2023/wordml/word16du" xmlns:w16sdtdh="http://schemas.microsoft.com/office/word/2020/wordml/sdtdatahash" xmlns:w16sdtfl="http://schemas.microsoft.com/office/word/2024/wordml/sdtformatlock" xmlns:w16se="http://schemas.microsoft.com/office/word/2015/wordml/symex" xmlns:wpg="http://schemas.microsoft.com/office/word/2010/wordprocessingGroup" xmlns:wpi="http://schemas.microsoft.com/office/word/2010/wordprocessingInk" xmlns:wne="http://schemas.microsoft.com/office/word/2006/wordml" xmlns:wps="http://schemas.microsoft.com/office/word/2010/wordprocessingShape" mc:Ignorable="w14 w15 w16se w16cid w16 w16cex w16sdtdh w16sdtfl w16du wp14">
   <w:body>
     <w:p>
       <w:pPr>
@@ -189,7 +189,29 @@
           <w:sz w:val="30"/>
           <w:szCs w:val="30"/>
         </w:rPr>
-        <w:t xml:space="preserve">ENTREGA N° 1 </w:t>
+        <w:t xml:space="preserve">ENTREGA </w:t>
+      </w:r>
+      <w:proofErr w:type="spellStart"/>
+      <w:r>
+        <w:rPr>
+          <w:rFonts w:eastAsia="Times New Roman"/>
+          <w:b/>
+          <w:bCs/>
+          <w:sz w:val="30"/>
+          <w:szCs w:val="30"/>
+        </w:rPr>
+        <w:t>N°</w:t>
+      </w:r>
+      <w:proofErr w:type="spellEnd"/>
+      <w:r>
+        <w:rPr>
+          <w:rFonts w:eastAsia="Times New Roman"/>
+          <w:b/>
+          <w:bCs/>
+          <w:sz w:val="30"/>
+          <w:szCs w:val="30"/>
+        </w:rPr>
+        <w:t xml:space="preserve"> 1 </w:t>
       </w:r>
     </w:p>
     <w:p>
@@ -1422,17 +1444,44 @@
         <w:shd w:val="clear" w:color="auto" w:fill="FFFFFF"/>
         <w:spacing w:before="120" w:after="120" w:line="360" w:lineRule="auto"/>
         <w:jc w:val="both"/>
+        <w:rPr>
+          <w:b/>
+          <w:bCs/>
+          <w:u w:val="single"/>
+        </w:rPr>
+      </w:pPr>
+      <w:r>
+        <w:rPr>
+          <w:b/>
+          <w:bCs/>
+          <w:u w:val="single"/>
+        </w:rPr>
+        <w:lastRenderedPageBreak/>
+        <w:t>Diagrama de Clase</w:t>
+      </w:r>
+    </w:p>
+    <w:p>
+      <w:pPr>
+        <w:shd w:val="clear" w:color="auto" w:fill="FFFFFF"/>
+        <w:spacing w:before="120" w:after="120" w:line="360" w:lineRule="auto"/>
+        <w:jc w:val="both"/>
+      </w:pPr>
+    </w:p>
+    <w:p>
+      <w:pPr>
+        <w:shd w:val="clear" w:color="auto" w:fill="FFFFFF"/>
+        <w:spacing w:before="120" w:after="120" w:line="360" w:lineRule="auto"/>
+        <w:jc w:val="both"/>
       </w:pPr>
       <w:r>
         <w:rPr>
           <w:noProof/>
         </w:rPr>
-        <w:lastRenderedPageBreak/>
         <w:drawing>
-          <wp:inline distT="0" distB="0" distL="0" distR="0" wp14:anchorId="46EA2F2B" wp14:editId="2EDA7F5E">
-            <wp:extent cx="5734050" cy="4052570"/>
-            <wp:effectExtent l="0" t="0" r="0" b="5080"/>
-            <wp:docPr id="389463556" name="Imagen 1"/>
+          <wp:inline distT="0" distB="0" distL="0" distR="0" wp14:anchorId="68102466" wp14:editId="4E515191">
+            <wp:extent cx="5722620" cy="4061460"/>
+            <wp:effectExtent l="0" t="0" r="0" b="0"/>
+            <wp:docPr id="1878529069" name="Imagen 1"/>
             <wp:cNvGraphicFramePr>
               <a:graphicFrameLocks xmlns:a="http://schemas.openxmlformats.org/drawingml/2006/main" noChangeAspect="1"/>
             </wp:cNvGraphicFramePr>
@@ -1461,7 +1510,7 @@
                   <pic:spPr bwMode="auto">
                     <a:xfrm>
                       <a:off x="0" y="0"/>
-                      <a:ext cx="5734050" cy="4052570"/>
+                      <a:ext cx="5722620" cy="4061460"/>
                     </a:xfrm>
                     <a:prstGeom prst="rect">
                       <a:avLst/>
@@ -1485,9 +1534,168 @@
         <w:jc w:val="both"/>
       </w:pPr>
     </w:p>
+    <w:p>
+      <w:pPr>
+        <w:shd w:val="clear" w:color="auto" w:fill="FFFFFF"/>
+        <w:spacing w:before="120" w:after="120" w:line="360" w:lineRule="auto"/>
+        <w:jc w:val="both"/>
+      </w:pPr>
+    </w:p>
+    <w:p>
+      <w:pPr>
+        <w:shd w:val="clear" w:color="auto" w:fill="FFFFFF"/>
+        <w:spacing w:before="120" w:after="120" w:line="360" w:lineRule="auto"/>
+        <w:jc w:val="both"/>
+      </w:pPr>
+    </w:p>
+    <w:p>
+      <w:pPr>
+        <w:shd w:val="clear" w:color="auto" w:fill="FFFFFF"/>
+        <w:spacing w:before="120" w:after="120" w:line="360" w:lineRule="auto"/>
+        <w:jc w:val="both"/>
+      </w:pPr>
+    </w:p>
+    <w:p>
+      <w:pPr>
+        <w:shd w:val="clear" w:color="auto" w:fill="FFFFFF"/>
+        <w:spacing w:before="120" w:after="120" w:line="360" w:lineRule="auto"/>
+        <w:jc w:val="both"/>
+      </w:pPr>
+    </w:p>
+    <w:p>
+      <w:pPr>
+        <w:shd w:val="clear" w:color="auto" w:fill="FFFFFF"/>
+        <w:spacing w:before="120" w:after="120" w:line="360" w:lineRule="auto"/>
+        <w:jc w:val="both"/>
+      </w:pPr>
+    </w:p>
+    <w:p>
+      <w:pPr>
+        <w:shd w:val="clear" w:color="auto" w:fill="FFFFFF"/>
+        <w:spacing w:before="120" w:after="120" w:line="360" w:lineRule="auto"/>
+        <w:jc w:val="both"/>
+      </w:pPr>
+    </w:p>
+    <w:p>
+      <w:pPr>
+        <w:shd w:val="clear" w:color="auto" w:fill="FFFFFF"/>
+        <w:spacing w:before="120" w:after="120" w:line="360" w:lineRule="auto"/>
+        <w:jc w:val="both"/>
+      </w:pPr>
+    </w:p>
+    <w:p>
+      <w:pPr>
+        <w:shd w:val="clear" w:color="auto" w:fill="FFFFFF"/>
+        <w:spacing w:before="120" w:after="120" w:line="360" w:lineRule="auto"/>
+        <w:jc w:val="both"/>
+      </w:pPr>
+    </w:p>
+    <w:p>
+      <w:pPr>
+        <w:shd w:val="clear" w:color="auto" w:fill="FFFFFF"/>
+        <w:spacing w:before="120" w:after="120" w:line="360" w:lineRule="auto"/>
+        <w:jc w:val="both"/>
+        <w:rPr>
+          <w:b/>
+          <w:bCs/>
+          <w:u w:val="single"/>
+        </w:rPr>
+      </w:pPr>
+      <w:r>
+        <w:rPr>
+          <w:b/>
+          <w:bCs/>
+          <w:u w:val="single"/>
+        </w:rPr>
+        <w:lastRenderedPageBreak/>
+        <w:t xml:space="preserve">Diagrama de </w:t>
+      </w:r>
+      <w:r>
+        <w:rPr>
+          <w:b/>
+          <w:bCs/>
+          <w:u w:val="single"/>
+        </w:rPr>
+        <w:t>C</w:t>
+      </w:r>
+      <w:r>
+        <w:rPr>
+          <w:b/>
+          <w:bCs/>
+          <w:u w:val="single"/>
+        </w:rPr>
+        <w:t>aso de uso</w:t>
+      </w:r>
+    </w:p>
+    <w:p>
+      <w:pPr>
+        <w:shd w:val="clear" w:color="auto" w:fill="FFFFFF"/>
+        <w:spacing w:before="120" w:after="120" w:line="360" w:lineRule="auto"/>
+        <w:jc w:val="both"/>
+        <w:rPr>
+          <w:b/>
+          <w:bCs/>
+        </w:rPr>
+      </w:pPr>
+      <w:r>
+        <w:rPr>
+          <w:b/>
+          <w:bCs/>
+          <w:noProof/>
+        </w:rPr>
+        <w:drawing>
+          <wp:inline distT="0" distB="0" distL="0" distR="0" wp14:anchorId="22E519BC" wp14:editId="1C45206B">
+            <wp:extent cx="5730240" cy="4259580"/>
+            <wp:effectExtent l="0" t="0" r="3810" b="7620"/>
+            <wp:docPr id="2113588904" name="Imagen 2"/>
+            <wp:cNvGraphicFramePr>
+              <a:graphicFrameLocks xmlns:a="http://schemas.openxmlformats.org/drawingml/2006/main" noChangeAspect="1"/>
+            </wp:cNvGraphicFramePr>
+            <a:graphic xmlns:a="http://schemas.openxmlformats.org/drawingml/2006/main">
+              <a:graphicData uri="http://schemas.openxmlformats.org/drawingml/2006/picture">
+                <pic:pic xmlns:pic="http://schemas.openxmlformats.org/drawingml/2006/picture">
+                  <pic:nvPicPr>
+                    <pic:cNvPr id="0" name="Picture 4"/>
+                    <pic:cNvPicPr>
+                      <a:picLocks noChangeAspect="1" noChangeArrowheads="1"/>
+                    </pic:cNvPicPr>
+                  </pic:nvPicPr>
+                  <pic:blipFill>
+                    <a:blip r:embed="rId19">
+                      <a:extLst>
+                        <a:ext uri="{28A0092B-C50C-407E-A947-70E740481C1C}">
+                          <a14:useLocalDpi xmlns:a14="http://schemas.microsoft.com/office/drawing/2010/main" val="0"/>
+                        </a:ext>
+                      </a:extLst>
+                    </a:blip>
+                    <a:srcRect/>
+                    <a:stretch>
+                      <a:fillRect/>
+                    </a:stretch>
+                  </pic:blipFill>
+                  <pic:spPr bwMode="auto">
+                    <a:xfrm>
+                      <a:off x="0" y="0"/>
+                      <a:ext cx="5730240" cy="4259580"/>
+                    </a:xfrm>
+                    <a:prstGeom prst="rect">
+                      <a:avLst/>
+                    </a:prstGeom>
+                    <a:noFill/>
+                    <a:ln>
+                      <a:noFill/>
+                    </a:ln>
+                  </pic:spPr>
+                </pic:pic>
+              </a:graphicData>
+            </a:graphic>
+          </wp:inline>
+        </w:drawing>
+      </w:r>
+    </w:p>
     <w:sectPr>
-      <w:headerReference w:type="default" r:id="rId19"/>
-      <w:footerReference w:type="default" r:id="rId20"/>
+      <w:headerReference w:type="default" r:id="rId20"/>
+      <w:footerReference w:type="default" r:id="rId21"/>
       <w:pgSz w:w="11909" w:h="16834"/>
       <w:pgMar w:top="1440" w:right="1440" w:bottom="1440" w:left="1440" w:header="720" w:footer="720" w:gutter="0"/>
       <w:pgNumType w:start="1"/>
@@ -1498,7 +1706,7 @@
 </file>
 
 <file path=word/endnotes.xml><?xml version="1.0" encoding="utf-8"?>
-<w:endnotes xmlns:wpc="http://schemas.microsoft.com/office/word/2010/wordprocessingCanvas" xmlns:cx="http://schemas.microsoft.com/office/drawing/2014/chartex" xmlns:cx1="http://schemas.microsoft.com/office/drawing/2015/9/8/chartex" xmlns:cx2="http://schemas.microsoft.com/office/drawing/2015/10/21/chartex" xmlns:cx3="http://schemas.microsoft.com/office/drawing/2016/5/9/chartex" xmlns:cx4="http://schemas.microsoft.com/office/drawing/2016/5/10/chartex" xmlns:cx5="http://schemas.microsoft.com/office/drawing/2016/5/11/chartex" xmlns:cx6="http://schemas.microsoft.com/office/drawing/2016/5/12/chartex" xmlns:cx7="http://schemas.microsoft.com/office/drawing/2016/5/13/chartex" xmlns:cx8="http://schemas.microsoft.com/office/drawing/2016/5/14/chartex" xmlns:mc="http://schemas.openxmlformats.org/markup-compatibility/2006" xmlns:aink="http://schemas.microsoft.com/office/drawing/2016/ink" xmlns:am3d="http://schemas.microsoft.com/office/drawing/2017/model3d" xmlns:o="urn:schemas-microsoft-com:office:office" xmlns:oel="http://schemas.microsoft.com/office/2019/extlst" xmlns:r="http://schemas.openxmlformats.org/officeDocument/2006/relationships" xmlns:m="http://schemas.openxmlformats.org/officeDocument/2006/math" xmlns:v="urn:schemas-microsoft-com:vml" xmlns:wp14="http://schemas.microsoft.com/office/word/2010/wordprocessingDrawing" xmlns:wp="http://schemas.openxmlformats.org/drawingml/2006/wordprocessingDrawing" xmlns:w10="urn:schemas-microsoft-com:office:word" xmlns:w="http://schemas.openxmlformats.org/wordprocessingml/2006/main" xmlns:w14="http://schemas.microsoft.com/office/word/2010/wordml" xmlns:w15="http://schemas.microsoft.com/office/word/2012/wordml" xmlns:w16cei="http://schemas.microsoft.com/office/word/2026/wordml/cei" xmlns:w16cex="http://schemas.microsoft.com/office/word/2018/wordml/cex" xmlns:w16cid="http://schemas.microsoft.com/office/word/2016/wordml/cid" xmlns:w16="http://schemas.microsoft.com/office/word/2018/wordml" xmlns:w16du="http://schemas.microsoft.com/office/word/2023/wordml/word16du" xmlns:w16sdtdh="http://schemas.microsoft.com/office/word/2020/wordml/sdtdatahash" xmlns:w16sdtfl="http://schemas.microsoft.com/office/word/2024/wordml/sdtformatlock" xmlns:w16se="http://schemas.microsoft.com/office/word/2015/wordml/symex" xmlns:wpg="http://schemas.microsoft.com/office/word/2010/wordprocessingGroup" xmlns:wpi="http://schemas.microsoft.com/office/word/2010/wordprocessingInk" xmlns:wne="http://schemas.microsoft.com/office/word/2006/wordml" xmlns:wps="http://schemas.microsoft.com/office/word/2010/wordprocessingShape" mc:Ignorable="w14 w15 w16se w16cid w16 w16cex w16sdtdh w16sdtfl w16du wp14">
+<w:endnotes xmlns:wpc="http://schemas.microsoft.com/office/word/2010/wordprocessingCanvas" xmlns:cx="http://schemas.microsoft.com/office/drawing/2014/chartex" xmlns:cx1="http://schemas.microsoft.com/office/drawing/2015/9/8/chartex" xmlns:cx2="http://schemas.microsoft.com/office/drawing/2015/10/21/chartex" xmlns:cx3="http://schemas.microsoft.com/office/drawing/2016/5/9/chartex" xmlns:cx4="http://schemas.microsoft.com/office/drawing/2016/5/10/chartex" xmlns:cx5="http://schemas.microsoft.com/office/drawing/2016/5/11/chartex" xmlns:cx6="http://schemas.microsoft.com/office/drawing/2016/5/12/chartex" xmlns:cx7="http://schemas.microsoft.com/office/drawing/2016/5/13/chartex" xmlns:cx8="http://schemas.microsoft.com/office/drawing/2016/5/14/chartex" xmlns:mc="http://schemas.openxmlformats.org/markup-compatibility/2006" xmlns:aink="http://schemas.microsoft.com/office/drawing/2016/ink" xmlns:am3d="http://schemas.microsoft.com/office/drawing/2017/model3d" xmlns:o="urn:schemas-microsoft-com:office:office" xmlns:oel="http://schemas.microsoft.com/office/2019/extlst" xmlns:r="http://schemas.openxmlformats.org/officeDocument/2006/relationships" xmlns:m="http://schemas.openxmlformats.org/officeDocument/2006/math" xmlns:v="urn:schemas-microsoft-com:vml" xmlns:wp14="http://schemas.microsoft.com/office/word/2010/wordprocessingDrawing" xmlns:wp="http://schemas.openxmlformats.org/drawingml/2006/wordprocessingDrawing" xmlns:w10="urn:schemas-microsoft-com:office:word" xmlns:w="http://schemas.openxmlformats.org/wordprocessingml/2006/main" xmlns:w14="http://schemas.microsoft.com/office/word/2010/wordml" xmlns:w15="http://schemas.microsoft.com/office/word/2012/wordml" xmlns:w16cex="http://schemas.microsoft.com/office/word/2018/wordml/cex" xmlns:w16cid="http://schemas.microsoft.com/office/word/2016/wordml/cid" xmlns:w16="http://schemas.microsoft.com/office/word/2018/wordml" xmlns:w16du="http://schemas.microsoft.com/office/word/2023/wordml/word16du" xmlns:w16sdtdh="http://schemas.microsoft.com/office/word/2020/wordml/sdtdatahash" xmlns:w16sdtfl="http://schemas.microsoft.com/office/word/2024/wordml/sdtformatlock" xmlns:w16se="http://schemas.microsoft.com/office/word/2015/wordml/symex" xmlns:wpg="http://schemas.microsoft.com/office/word/2010/wordprocessingGroup" xmlns:wpi="http://schemas.microsoft.com/office/word/2010/wordprocessingInk" xmlns:wne="http://schemas.microsoft.com/office/word/2006/wordml" xmlns:wps="http://schemas.microsoft.com/office/word/2010/wordprocessingShape" mc:Ignorable="w14 w15 w16se w16cid w16 w16cex w16sdtdh w16sdtfl w16du wp14">
   <w:endnote w:type="separator" w:id="-1">
     <w:p>
       <w:pPr>
@@ -1523,7 +1731,7 @@
 </file>
 
 <file path=word/footer1.xml><?xml version="1.0" encoding="utf-8"?>
-<w:ftr xmlns:wpc="http://schemas.microsoft.com/office/word/2010/wordprocessingCanvas" xmlns:cx="http://schemas.microsoft.com/office/drawing/2014/chartex" xmlns:cx1="http://schemas.microsoft.com/office/drawing/2015/9/8/chartex" xmlns:cx2="http://schemas.microsoft.com/office/drawing/2015/10/21/chartex" xmlns:cx3="http://schemas.microsoft.com/office/drawing/2016/5/9/chartex" xmlns:cx4="http://schemas.microsoft.com/office/drawing/2016/5/10/chartex" xmlns:cx5="http://schemas.microsoft.com/office/drawing/2016/5/11/chartex" xmlns:cx6="http://schemas.microsoft.com/office/drawing/2016/5/12/chartex" xmlns:cx7="http://schemas.microsoft.com/office/drawing/2016/5/13/chartex" xmlns:cx8="http://schemas.microsoft.com/office/drawing/2016/5/14/chartex" xmlns:mc="http://schemas.openxmlformats.org/markup-compatibility/2006" xmlns:aink="http://schemas.microsoft.com/office/drawing/2016/ink" xmlns:am3d="http://schemas.microsoft.com/office/drawing/2017/model3d" xmlns:o="urn:schemas-microsoft-com:office:office" xmlns:oel="http://schemas.microsoft.com/office/2019/extlst" xmlns:r="http://schemas.openxmlformats.org/officeDocument/2006/relationships" xmlns:m="http://schemas.openxmlformats.org/officeDocument/2006/math" xmlns:v="urn:schemas-microsoft-com:vml" xmlns:wp14="http://schemas.microsoft.com/office/word/2010/wordprocessingDrawing" xmlns:wp="http://schemas.openxmlformats.org/drawingml/2006/wordprocessingDrawing" xmlns:w10="urn:schemas-microsoft-com:office:word" xmlns:w="http://schemas.openxmlformats.org/wordprocessingml/2006/main" xmlns:w14="http://schemas.microsoft.com/office/word/2010/wordml" xmlns:w15="http://schemas.microsoft.com/office/word/2012/wordml" xmlns:w16cei="http://schemas.microsoft.com/office/word/2026/wordml/cei" xmlns:w16cex="http://schemas.microsoft.com/office/word/2018/wordml/cex" xmlns:w16cid="http://schemas.microsoft.com/office/word/2016/wordml/cid" xmlns:w16="http://schemas.microsoft.com/office/word/2018/wordml" xmlns:w16du="http://schemas.microsoft.com/office/word/2023/wordml/word16du" xmlns:w16sdtdh="http://schemas.microsoft.com/office/word/2020/wordml/sdtdatahash" xmlns:w16sdtfl="http://schemas.microsoft.com/office/word/2024/wordml/sdtformatlock" xmlns:w16se="http://schemas.microsoft.com/office/word/2015/wordml/symex" xmlns:wpg="http://schemas.microsoft.com/office/word/2010/wordprocessingGroup" xmlns:wpi="http://schemas.microsoft.com/office/word/2010/wordprocessingInk" xmlns:wne="http://schemas.microsoft.com/office/word/2006/wordml" xmlns:wps="http://schemas.microsoft.com/office/word/2010/wordprocessingShape" mc:Ignorable="w14 w15 w16se w16cid w16 w16cex w16sdtdh w16sdtfl w16du wp14">
+<w:ftr xmlns:wpc="http://schemas.microsoft.com/office/word/2010/wordprocessingCanvas" xmlns:cx="http://schemas.microsoft.com/office/drawing/2014/chartex" xmlns:cx1="http://schemas.microsoft.com/office/drawing/2015/9/8/chartex" xmlns:cx2="http://schemas.microsoft.com/office/drawing/2015/10/21/chartex" xmlns:cx3="http://schemas.microsoft.com/office/drawing/2016/5/9/chartex" xmlns:cx4="http://schemas.microsoft.com/office/drawing/2016/5/10/chartex" xmlns:cx5="http://schemas.microsoft.com/office/drawing/2016/5/11/chartex" xmlns:cx6="http://schemas.microsoft.com/office/drawing/2016/5/12/chartex" xmlns:cx7="http://schemas.microsoft.com/office/drawing/2016/5/13/chartex" xmlns:cx8="http://schemas.microsoft.com/office/drawing/2016/5/14/chartex" xmlns:mc="http://schemas.openxmlformats.org/markup-compatibility/2006" xmlns:aink="http://schemas.microsoft.com/office/drawing/2016/ink" xmlns:am3d="http://schemas.microsoft.com/office/drawing/2017/model3d" xmlns:o="urn:schemas-microsoft-com:office:office" xmlns:oel="http://schemas.microsoft.com/office/2019/extlst" xmlns:r="http://schemas.openxmlformats.org/officeDocument/2006/relationships" xmlns:m="http://schemas.openxmlformats.org/officeDocument/2006/math" xmlns:v="urn:schemas-microsoft-com:vml" xmlns:wp14="http://schemas.microsoft.com/office/word/2010/wordprocessingDrawing" xmlns:wp="http://schemas.openxmlformats.org/drawingml/2006/wordprocessingDrawing" xmlns:w10="urn:schemas-microsoft-com:office:word" xmlns:w="http://schemas.openxmlformats.org/wordprocessingml/2006/main" xmlns:w14="http://schemas.microsoft.com/office/word/2010/wordml" xmlns:w15="http://schemas.microsoft.com/office/word/2012/wordml" xmlns:w16cex="http://schemas.microsoft.com/office/word/2018/wordml/cex" xmlns:w16cid="http://schemas.microsoft.com/office/word/2016/wordml/cid" xmlns:w16="http://schemas.microsoft.com/office/word/2018/wordml" xmlns:w16du="http://schemas.microsoft.com/office/word/2023/wordml/word16du" xmlns:w16sdtdh="http://schemas.microsoft.com/office/word/2020/wordml/sdtdatahash" xmlns:w16sdtfl="http://schemas.microsoft.com/office/word/2024/wordml/sdtformatlock" xmlns:w16se="http://schemas.microsoft.com/office/word/2015/wordml/symex" xmlns:wpg="http://schemas.microsoft.com/office/word/2010/wordprocessingGroup" xmlns:wpi="http://schemas.microsoft.com/office/word/2010/wordprocessingInk" xmlns:wne="http://schemas.microsoft.com/office/word/2006/wordml" xmlns:wps="http://schemas.microsoft.com/office/word/2010/wordprocessingShape" mc:Ignorable="w14 w15 w16se w16cid w16 w16cex w16sdtdh w16sdtfl w16du wp14">
   <w:p/>
   <w:p>
     <w:r>
@@ -1574,7 +1782,7 @@
 </file>
 
 <file path=word/footnotes.xml><?xml version="1.0" encoding="utf-8"?>
-<w:footnotes xmlns:wpc="http://schemas.microsoft.com/office/word/2010/wordprocessingCanvas" xmlns:cx="http://schemas.microsoft.com/office/drawing/2014/chartex" xmlns:cx1="http://schemas.microsoft.com/office/drawing/2015/9/8/chartex" xmlns:cx2="http://schemas.microsoft.com/office/drawing/2015/10/21/chartex" xmlns:cx3="http://schemas.microsoft.com/office/drawing/2016/5/9/chartex" xmlns:cx4="http://schemas.microsoft.com/office/drawing/2016/5/10/chartex" xmlns:cx5="http://schemas.microsoft.com/office/drawing/2016/5/11/chartex" xmlns:cx6="http://schemas.microsoft.com/office/drawing/2016/5/12/chartex" xmlns:cx7="http://schemas.microsoft.com/office/drawing/2016/5/13/chartex" xmlns:cx8="http://schemas.microsoft.com/office/drawing/2016/5/14/chartex" xmlns:mc="http://schemas.openxmlformats.org/markup-compatibility/2006" xmlns:aink="http://schemas.microsoft.com/office/drawing/2016/ink" xmlns:am3d="http://schemas.microsoft.com/office/drawing/2017/model3d" xmlns:o="urn:schemas-microsoft-com:office:office" xmlns:oel="http://schemas.microsoft.com/office/2019/extlst" xmlns:r="http://schemas.openxmlformats.org/officeDocument/2006/relationships" xmlns:m="http://schemas.openxmlformats.org/officeDocument/2006/math" xmlns:v="urn:schemas-microsoft-com:vml" xmlns:wp14="http://schemas.microsoft.com/office/word/2010/wordprocessingDrawing" xmlns:wp="http://schemas.openxmlformats.org/drawingml/2006/wordprocessingDrawing" xmlns:w10="urn:schemas-microsoft-com:office:word" xmlns:w="http://schemas.openxmlformats.org/wordprocessingml/2006/main" xmlns:w14="http://schemas.microsoft.com/office/word/2010/wordml" xmlns:w15="http://schemas.microsoft.com/office/word/2012/wordml" xmlns:w16cei="http://schemas.microsoft.com/office/word/2026/wordml/cei" xmlns:w16cex="http://schemas.microsoft.com/office/word/2018/wordml/cex" xmlns:w16cid="http://schemas.microsoft.com/office/word/2016/wordml/cid" xmlns:w16="http://schemas.microsoft.com/office/word/2018/wordml" xmlns:w16du="http://schemas.microsoft.com/office/word/2023/wordml/word16du" xmlns:w16sdtdh="http://schemas.microsoft.com/office/word/2020/wordml/sdtdatahash" xmlns:w16sdtfl="http://schemas.microsoft.com/office/word/2024/wordml/sdtformatlock" xmlns:w16se="http://schemas.microsoft.com/office/word/2015/wordml/symex" xmlns:wpg="http://schemas.microsoft.com/office/word/2010/wordprocessingGroup" xmlns:wpi="http://schemas.microsoft.com/office/word/2010/wordprocessingInk" xmlns:wne="http://schemas.microsoft.com/office/word/2006/wordml" xmlns:wps="http://schemas.microsoft.com/office/word/2010/wordprocessingShape" mc:Ignorable="w14 w15 w16se w16cid w16 w16cex w16sdtdh w16sdtfl w16du wp14">
+<w:footnotes xmlns:wpc="http://schemas.microsoft.com/office/word/2010/wordprocessingCanvas" xmlns:cx="http://schemas.microsoft.com/office/drawing/2014/chartex" xmlns:cx1="http://schemas.microsoft.com/office/drawing/2015/9/8/chartex" xmlns:cx2="http://schemas.microsoft.com/office/drawing/2015/10/21/chartex" xmlns:cx3="http://schemas.microsoft.com/office/drawing/2016/5/9/chartex" xmlns:cx4="http://schemas.microsoft.com/office/drawing/2016/5/10/chartex" xmlns:cx5="http://schemas.microsoft.com/office/drawing/2016/5/11/chartex" xmlns:cx6="http://schemas.microsoft.com/office/drawing/2016/5/12/chartex" xmlns:cx7="http://schemas.microsoft.com/office/drawing/2016/5/13/chartex" xmlns:cx8="http://schemas.microsoft.com/office/drawing/2016/5/14/chartex" xmlns:mc="http://schemas.openxmlformats.org/markup-compatibility/2006" xmlns:aink="http://schemas.microsoft.com/office/drawing/2016/ink" xmlns:am3d="http://schemas.microsoft.com/office/drawing/2017/model3d" xmlns:o="urn:schemas-microsoft-com:office:office" xmlns:oel="http://schemas.microsoft.com/office/2019/extlst" xmlns:r="http://schemas.openxmlformats.org/officeDocument/2006/relationships" xmlns:m="http://schemas.openxmlformats.org/officeDocument/2006/math" xmlns:v="urn:schemas-microsoft-com:vml" xmlns:wp14="http://schemas.microsoft.com/office/word/2010/wordprocessingDrawing" xmlns:wp="http://schemas.openxmlformats.org/drawingml/2006/wordprocessingDrawing" xmlns:w10="urn:schemas-microsoft-com:office:word" xmlns:w="http://schemas.openxmlformats.org/wordprocessingml/2006/main" xmlns:w14="http://schemas.microsoft.com/office/word/2010/wordml" xmlns:w15="http://schemas.microsoft.com/office/word/2012/wordml" xmlns:w16cex="http://schemas.microsoft.com/office/word/2018/wordml/cex" xmlns:w16cid="http://schemas.microsoft.com/office/word/2016/wordml/cid" xmlns:w16="http://schemas.microsoft.com/office/word/2018/wordml" xmlns:w16du="http://schemas.microsoft.com/office/word/2023/wordml/word16du" xmlns:w16sdtdh="http://schemas.microsoft.com/office/word/2020/wordml/sdtdatahash" xmlns:w16sdtfl="http://schemas.microsoft.com/office/word/2024/wordml/sdtformatlock" xmlns:w16se="http://schemas.microsoft.com/office/word/2015/wordml/symex" xmlns:wpg="http://schemas.microsoft.com/office/word/2010/wordprocessingGroup" xmlns:wpi="http://schemas.microsoft.com/office/word/2010/wordprocessingInk" xmlns:wne="http://schemas.microsoft.com/office/word/2006/wordml" xmlns:wps="http://schemas.microsoft.com/office/word/2010/wordprocessingShape" mc:Ignorable="w14 w15 w16se w16cid w16 w16cex w16sdtdh w16sdtfl w16du wp14">
   <w:footnote w:type="separator" w:id="-1">
     <w:p>
       <w:pPr>
@@ -1599,7 +1807,7 @@
 </file>
 
 <file path=word/header1.xml><?xml version="1.0" encoding="utf-8"?>
-<w:hdr xmlns:wpc="http://schemas.microsoft.com/office/word/2010/wordprocessingCanvas" xmlns:cx="http://schemas.microsoft.com/office/drawing/2014/chartex" xmlns:cx1="http://schemas.microsoft.com/office/drawing/2015/9/8/chartex" xmlns:cx2="http://schemas.microsoft.com/office/drawing/2015/10/21/chartex" xmlns:cx3="http://schemas.microsoft.com/office/drawing/2016/5/9/chartex" xmlns:cx4="http://schemas.microsoft.com/office/drawing/2016/5/10/chartex" xmlns:cx5="http://schemas.microsoft.com/office/drawing/2016/5/11/chartex" xmlns:cx6="http://schemas.microsoft.com/office/drawing/2016/5/12/chartex" xmlns:cx7="http://schemas.microsoft.com/office/drawing/2016/5/13/chartex" xmlns:cx8="http://schemas.microsoft.com/office/drawing/2016/5/14/chartex" xmlns:mc="http://schemas.openxmlformats.org/markup-compatibility/2006" xmlns:aink="http://schemas.microsoft.com/office/drawing/2016/ink" xmlns:am3d="http://schemas.microsoft.com/office/drawing/2017/model3d" xmlns:o="urn:schemas-microsoft-com:office:office" xmlns:oel="http://schemas.microsoft.com/office/2019/extlst" xmlns:r="http://schemas.openxmlformats.org/officeDocument/2006/relationships" xmlns:m="http://schemas.openxmlformats.org/officeDocument/2006/math" xmlns:v="urn:schemas-microsoft-com:vml" xmlns:wp14="http://schemas.microsoft.com/office/word/2010/wordprocessingDrawing" xmlns:wp="http://schemas.openxmlformats.org/drawingml/2006/wordprocessingDrawing" xmlns:w10="urn:schemas-microsoft-com:office:word" xmlns:w="http://schemas.openxmlformats.org/wordprocessingml/2006/main" xmlns:w14="http://schemas.microsoft.com/office/word/2010/wordml" xmlns:w15="http://schemas.microsoft.com/office/word/2012/wordml" xmlns:w16cei="http://schemas.microsoft.com/office/word/2026/wordml/cei" xmlns:w16cex="http://schemas.microsoft.com/office/word/2018/wordml/cex" xmlns:w16cid="http://schemas.microsoft.com/office/word/2016/wordml/cid" xmlns:w16="http://schemas.microsoft.com/office/word/2018/wordml" xmlns:w16du="http://schemas.microsoft.com/office/word/2023/wordml/word16du" xmlns:w16sdtdh="http://schemas.microsoft.com/office/word/2020/wordml/sdtdatahash" xmlns:w16sdtfl="http://schemas.microsoft.com/office/word/2024/wordml/sdtformatlock" xmlns:w16se="http://schemas.microsoft.com/office/word/2015/wordml/symex" xmlns:wpg="http://schemas.microsoft.com/office/word/2010/wordprocessingGroup" xmlns:wpi="http://schemas.microsoft.com/office/word/2010/wordprocessingInk" xmlns:wne="http://schemas.microsoft.com/office/word/2006/wordml" xmlns:wps="http://schemas.microsoft.com/office/word/2010/wordprocessingShape" mc:Ignorable="w14 w15 w16se w16cid w16 w16cex w16sdtdh w16sdtfl w16du wp14">
+<w:hdr xmlns:wpc="http://schemas.microsoft.com/office/word/2010/wordprocessingCanvas" xmlns:cx="http://schemas.microsoft.com/office/drawing/2014/chartex" xmlns:cx1="http://schemas.microsoft.com/office/drawing/2015/9/8/chartex" xmlns:cx2="http://schemas.microsoft.com/office/drawing/2015/10/21/chartex" xmlns:cx3="http://schemas.microsoft.com/office/drawing/2016/5/9/chartex" xmlns:cx4="http://schemas.microsoft.com/office/drawing/2016/5/10/chartex" xmlns:cx5="http://schemas.microsoft.com/office/drawing/2016/5/11/chartex" xmlns:cx6="http://schemas.microsoft.com/office/drawing/2016/5/12/chartex" xmlns:cx7="http://schemas.microsoft.com/office/drawing/2016/5/13/chartex" xmlns:cx8="http://schemas.microsoft.com/office/drawing/2016/5/14/chartex" xmlns:mc="http://schemas.openxmlformats.org/markup-compatibility/2006" xmlns:aink="http://schemas.microsoft.com/office/drawing/2016/ink" xmlns:am3d="http://schemas.microsoft.com/office/drawing/2017/model3d" xmlns:o="urn:schemas-microsoft-com:office:office" xmlns:oel="http://schemas.microsoft.com/office/2019/extlst" xmlns:r="http://schemas.openxmlformats.org/officeDocument/2006/relationships" xmlns:m="http://schemas.openxmlformats.org/officeDocument/2006/math" xmlns:v="urn:schemas-microsoft-com:vml" xmlns:wp14="http://schemas.microsoft.com/office/word/2010/wordprocessingDrawing" xmlns:wp="http://schemas.openxmlformats.org/drawingml/2006/wordprocessingDrawing" xmlns:w10="urn:schemas-microsoft-com:office:word" xmlns:w="http://schemas.openxmlformats.org/wordprocessingml/2006/main" xmlns:w14="http://schemas.microsoft.com/office/word/2010/wordml" xmlns:w15="http://schemas.microsoft.com/office/word/2012/wordml" xmlns:w16cex="http://schemas.microsoft.com/office/word/2018/wordml/cex" xmlns:w16cid="http://schemas.microsoft.com/office/word/2016/wordml/cid" xmlns:w16="http://schemas.microsoft.com/office/word/2018/wordml" xmlns:w16du="http://schemas.microsoft.com/office/word/2023/wordml/word16du" xmlns:w16sdtdh="http://schemas.microsoft.com/office/word/2020/wordml/sdtdatahash" xmlns:w16sdtfl="http://schemas.microsoft.com/office/word/2024/wordml/sdtformatlock" xmlns:w16se="http://schemas.microsoft.com/office/word/2015/wordml/symex" xmlns:wpg="http://schemas.microsoft.com/office/word/2010/wordprocessingGroup" xmlns:wpi="http://schemas.microsoft.com/office/word/2010/wordprocessingInk" xmlns:wne="http://schemas.microsoft.com/office/word/2006/wordml" xmlns:wps="http://schemas.microsoft.com/office/word/2010/wordprocessingShape" mc:Ignorable="w14 w15 w16se w16cid w16 w16cex w16sdtdh w16sdtfl w16du wp14">
   <w:p>
     <w:pPr>
       <w:widowControl w:val="0"/>

</xml_diff>